<commit_message>
Updates to interview after more end to end testing, updated DOCX added missing example images.
</commit_message>
<xml_diff>
--- a/docassemble/ParentingTimeSchedule/data/templates/Motion_to_modify_parenting_time.docx
+++ b/docassemble/ParentingTimeSchedule/data/templates/Motion_to_modify_parenting_time.docx
@@ -1,6 +1,6 @@
 
 <file path=word/document.xml><?xml version="1.0" encoding="utf-8"?>
-<w:document xmlns:wpc="http://schemas.microsoft.com/office/word/2010/wordprocessingCanvas" xmlns:cx="http://schemas.microsoft.com/office/drawing/2014/chartex" xmlns:cx1="http://schemas.microsoft.com/office/drawing/2015/9/8/chartex" xmlns:cx2="http://schemas.microsoft.com/office/drawing/2015/10/21/chartex" xmlns:cx3="http://schemas.microsoft.com/office/drawing/2016/5/9/chartex" xmlns:cx4="http://schemas.microsoft.com/office/drawing/2016/5/10/chartex" xmlns:cx5="http://schemas.microsoft.com/office/drawing/2016/5/11/chartex" xmlns:cx6="http://schemas.microsoft.com/office/drawing/2016/5/12/chartex" xmlns:cx7="http://schemas.microsoft.com/office/drawing/2016/5/13/chartex" xmlns:cx8="http://schemas.microsoft.com/office/drawing/2016/5/14/chartex" xmlns:mc="http://schemas.openxmlformats.org/markup-compatibility/2006" xmlns:aink="http://schemas.microsoft.com/office/drawing/2016/ink" xmlns:am3d="http://schemas.microsoft.com/office/drawing/2017/model3d" xmlns:o="urn:schemas-microsoft-com:office:office" xmlns:oel="http://schemas.microsoft.com/office/2019/extlst" xmlns:r="http://schemas.openxmlformats.org/officeDocument/2006/relationships" xmlns:m="http://schemas.openxmlformats.org/officeDocument/2006/math" xmlns:v="urn:schemas-microsoft-com:vml" xmlns:wp14="http://schemas.microsoft.com/office/word/2010/wordprocessingDrawing" xmlns:wp="http://schemas.openxmlformats.org/drawingml/2006/wordprocessingDrawing" xmlns:w10="urn:schemas-microsoft-com:office:word" xmlns:w="http://schemas.openxmlformats.org/wordprocessingml/2006/main" xmlns:w14="http://schemas.microsoft.com/office/word/2010/wordml" xmlns:w15="http://schemas.microsoft.com/office/word/2012/wordml" xmlns:w16cex="http://schemas.microsoft.com/office/word/2018/wordml/cex" xmlns:w16cid="http://schemas.microsoft.com/office/word/2016/wordml/cid" xmlns:w16="http://schemas.microsoft.com/office/word/2018/wordml" xmlns:w16sdtdh="http://schemas.microsoft.com/office/word/2020/wordml/sdtdatahash" xmlns:w16se="http://schemas.microsoft.com/office/word/2015/wordml/symex" xmlns:wpg="http://schemas.microsoft.com/office/word/2010/wordprocessingGroup" xmlns:wpi="http://schemas.microsoft.com/office/word/2010/wordprocessingInk" xmlns:wne="http://schemas.microsoft.com/office/word/2006/wordml" xmlns:wps="http://schemas.microsoft.com/office/word/2010/wordprocessingShape" mc:Ignorable="w14 w15 w16se w16cid w16 w16cex w16sdtdh wp14">
+<w:document xmlns:wpc="http://schemas.microsoft.com/office/word/2010/wordprocessingCanvas" xmlns:cx="http://schemas.microsoft.com/office/drawing/2014/chartex" xmlns:cx1="http://schemas.microsoft.com/office/drawing/2015/9/8/chartex" xmlns:cx2="http://schemas.microsoft.com/office/drawing/2015/10/21/chartex" xmlns:cx3="http://schemas.microsoft.com/office/drawing/2016/5/9/chartex" xmlns:cx4="http://schemas.microsoft.com/office/drawing/2016/5/10/chartex" xmlns:cx5="http://schemas.microsoft.com/office/drawing/2016/5/11/chartex" xmlns:cx6="http://schemas.microsoft.com/office/drawing/2016/5/12/chartex" xmlns:cx7="http://schemas.microsoft.com/office/drawing/2016/5/13/chartex" xmlns:cx8="http://schemas.microsoft.com/office/drawing/2016/5/14/chartex" xmlns:mc="http://schemas.openxmlformats.org/markup-compatibility/2006" xmlns:aink="http://schemas.microsoft.com/office/drawing/2016/ink" xmlns:am3d="http://schemas.microsoft.com/office/drawing/2017/model3d" xmlns:o="urn:schemas-microsoft-com:office:office" xmlns:oel="http://schemas.microsoft.com/office/2019/extlst" xmlns:r="http://schemas.openxmlformats.org/officeDocument/2006/relationships" xmlns:m="http://schemas.openxmlformats.org/officeDocument/2006/math" xmlns:v="urn:schemas-microsoft-com:vml" xmlns:wp14="http://schemas.microsoft.com/office/word/2010/wordprocessingDrawing" xmlns:wp="http://schemas.openxmlformats.org/drawingml/2006/wordprocessingDrawing" xmlns:w10="urn:schemas-microsoft-com:office:word" xmlns:w="http://schemas.openxmlformats.org/wordprocessingml/2006/main" xmlns:w14="http://schemas.microsoft.com/office/word/2010/wordml" xmlns:w15="http://schemas.microsoft.com/office/word/2012/wordml" xmlns:w16cex="http://schemas.microsoft.com/office/word/2018/wordml/cex" xmlns:w16cid="http://schemas.microsoft.com/office/word/2016/wordml/cid" xmlns:w16="http://schemas.microsoft.com/office/word/2018/wordml" xmlns:w16du="http://schemas.microsoft.com/office/word/2023/wordml/word16du" xmlns:w16sdtdh="http://schemas.microsoft.com/office/word/2020/wordml/sdtdatahash" xmlns:w16sdtfl="http://schemas.microsoft.com/office/word/2024/wordml/sdtformatlock" xmlns:w16se="http://schemas.microsoft.com/office/word/2015/wordml/symex" xmlns:wpg="http://schemas.microsoft.com/office/word/2010/wordprocessingGroup" xmlns:wpi="http://schemas.microsoft.com/office/word/2010/wordprocessingInk" xmlns:wne="http://schemas.microsoft.com/office/word/2006/wordml" xmlns:wps="http://schemas.microsoft.com/office/word/2010/wordprocessingShape" mc:Ignorable="w14 w15 w16se w16cid w16 w16cex w16sdtdh w16sdtfl w16du wp14">
   <w:body>
     <w:p>
       <w:pPr>
@@ -618,7 +618,13 @@
         <w:rPr>
           <w:rFonts w:ascii="Arial" w:hAnsi="Arial" w:cs="Arial"/>
         </w:rPr>
-        <w:t>me is {{ users[0].name_full() }}. I am {{ users[0].age_in_years() }} years old. {% if hide_address %}I am using an alternative address because disclosing my address would put me or my household at risk.{% else %}I live at {{ users[0].address.on_one_line(bare=True) }}.{% endif %}</w:t>
+        <w:t xml:space="preserve">name </w:t>
+      </w:r>
+      <w:r>
+        <w:rPr>
+          <w:rFonts w:ascii="Arial" w:hAnsi="Arial" w:cs="Arial"/>
+        </w:rPr>
+        <w:t>is {{ users[0].name_full() }}. I am {{ users[0].age_in_years() }} years old. {% if hide_address %}I am using an alternative address because disclosing my address would put me or my household at risk.{% else %}I live at {{ users[0].address.on_one_line(bare=True) }}.{% endif %}</w:t>
       </w:r>
     </w:p>
     <w:p>
@@ -643,7 +649,13 @@
         <w:rPr>
           <w:rFonts w:ascii="Arial" w:hAnsi="Arial" w:cs="Arial"/>
         </w:rPr>
-        <w:t>ther parent is {{ other_parties[0].name_full() }}.{% if knows_other_parent_dob %} They are {{ other_parties[0].age_in_years() }} years old.{% endif %}{% if knows_other_parent_address %} They live at {{ other_parties[0].address.on_one_line(bare=True) }}.{% endif %}</w:t>
+        <w:t xml:space="preserve">other </w:t>
+      </w:r>
+      <w:r>
+        <w:rPr>
+          <w:rFonts w:ascii="Arial" w:hAnsi="Arial" w:cs="Arial"/>
+        </w:rPr>
+        <w:t>parent is {{ other_parties[0].name_full() }}.{% if knows_other_parent_dob %} They are {{ other_parties[0].age_in_years() }} years old.{% endif %}{% if knows_other_parent_address %} They live at {{ other_parties[0].address.on_one_line(bare=True) }}.{% endif %}</w:t>
       </w:r>
     </w:p>
     <w:p>
@@ -3508,7 +3520,31 @@
         <w:rPr>
           <w:rFonts w:ascii="Arial" w:hAnsi="Arial" w:cs="Arial"/>
         </w:rPr>
-        <w:t>{% if holiday_list.any_true() %}</w:t>
+        <w:t xml:space="preserve">{% if holiday_list.any_true() </w:t>
+      </w:r>
+      <w:r>
+        <w:rPr>
+          <w:rFonts w:ascii="Arial" w:hAnsi="Arial" w:cs="Arial"/>
+        </w:rPr>
+        <w:t xml:space="preserve">or </w:t>
+      </w:r>
+      <w:r>
+        <w:rPr>
+          <w:rFonts w:ascii="Arial" w:hAnsi="Arial" w:cs="Arial"/>
+        </w:rPr>
+        <w:t>other_holidays.number_gathered()</w:t>
+      </w:r>
+      <w:r>
+        <w:rPr>
+          <w:rFonts w:ascii="Arial" w:hAnsi="Arial" w:cs="Arial"/>
+        </w:rPr>
+        <w:t xml:space="preserve"> &gt; 0 </w:t>
+      </w:r>
+      <w:r>
+        <w:rPr>
+          <w:rFonts w:ascii="Arial" w:hAnsi="Arial" w:cs="Arial"/>
+        </w:rPr>
+        <w:t>%}</w:t>
       </w:r>
       <w:r>
         <w:rPr>
@@ -3528,7 +3564,49 @@
         <w:rPr>
           <w:rFonts w:ascii="Arial" w:hAnsi="Arial" w:cs="Arial"/>
         </w:rPr>
-        <w:t>Each year, holidays may fall during school breaks, causing a conflict. When a conflict happens, the priority will be: 1st Priority: Holiday Schedule; 2nd Priority: School Break Schedule; 3rd Priority: Regular Weekly Schedule.</w:t>
+        <w:t xml:space="preserve">Each year, holidays may fall during school breaks, causing a conflict. When a conflict happens, the priority will be: </w:t>
+      </w:r>
+      <w:r>
+        <w:rPr>
+          <w:rFonts w:ascii="Arial" w:hAnsi="Arial" w:cs="Arial"/>
+          <w:b/>
+          <w:bCs/>
+        </w:rPr>
+        <w:t>1st Priority</w:t>
+      </w:r>
+      <w:r>
+        <w:rPr>
+          <w:rFonts w:ascii="Arial" w:hAnsi="Arial" w:cs="Arial"/>
+        </w:rPr>
+        <w:t xml:space="preserve">: Holiday Schedule; </w:t>
+      </w:r>
+      <w:r>
+        <w:rPr>
+          <w:rFonts w:ascii="Arial" w:hAnsi="Arial" w:cs="Arial"/>
+          <w:b/>
+          <w:bCs/>
+        </w:rPr>
+        <w:t>2nd Priority</w:t>
+      </w:r>
+      <w:r>
+        <w:rPr>
+          <w:rFonts w:ascii="Arial" w:hAnsi="Arial" w:cs="Arial"/>
+        </w:rPr>
+        <w:t xml:space="preserve">: School Break Schedule; </w:t>
+      </w:r>
+      <w:r>
+        <w:rPr>
+          <w:rFonts w:ascii="Arial" w:hAnsi="Arial" w:cs="Arial"/>
+          <w:b/>
+          <w:bCs/>
+        </w:rPr>
+        <w:t>3rd Priority</w:t>
+      </w:r>
+      <w:r>
+        <w:rPr>
+          <w:rFonts w:ascii="Arial" w:hAnsi="Arial" w:cs="Arial"/>
+        </w:rPr>
+        <w:t>: Regular Weekly Schedule.</w:t>
       </w:r>
     </w:p>
     <w:p>
@@ -3601,32 +3679,6 @@
           <w:rFonts w:ascii="Arial" w:hAnsi="Arial" w:cs="Arial"/>
         </w:rPr>
         <w:t xml:space="preserve"> {{ other_parties[0].name.initials }}</w:t>
-      </w:r>
-    </w:p>
-    <w:p>
-      <w:pPr>
-        <w:spacing w:after="0"/>
-        <w:rPr>
-          <w:rFonts w:ascii="Arial" w:hAnsi="Arial" w:cs="Arial"/>
-        </w:rPr>
-      </w:pPr>
-      <w:r>
-        <w:rPr>
-          <w:rFonts w:ascii="Arial" w:hAnsi="Arial" w:cs="Arial"/>
-        </w:rPr>
-        <w:t>{%</w:t>
-      </w:r>
-      <w:r>
-        <w:rPr>
-          <w:rFonts w:ascii="Arial" w:hAnsi="Arial" w:cs="Arial"/>
-        </w:rPr>
-        <w:t>p</w:t>
-      </w:r>
-      <w:r>
-        <w:rPr>
-          <w:rFonts w:ascii="Arial" w:hAnsi="Arial" w:cs="Arial"/>
-        </w:rPr>
-        <w:t xml:space="preserve"> if prepopulated_holidays %}</w:t>
       </w:r>
     </w:p>
     <w:p>
@@ -7280,32 +7332,6 @@
         <w:rPr>
           <w:rFonts w:ascii="Arial" w:hAnsi="Arial" w:cs="Arial"/>
         </w:rPr>
-        <w:t>{%</w:t>
-      </w:r>
-      <w:r>
-        <w:rPr>
-          <w:rFonts w:ascii="Arial" w:hAnsi="Arial" w:cs="Arial"/>
-        </w:rPr>
-        <w:t>p</w:t>
-      </w:r>
-      <w:r>
-        <w:rPr>
-          <w:rFonts w:ascii="Arial" w:hAnsi="Arial" w:cs="Arial"/>
-        </w:rPr>
-        <w:t xml:space="preserve"> endif %}</w:t>
-      </w:r>
-    </w:p>
-    <w:p>
-      <w:pPr>
-        <w:spacing w:after="0"/>
-        <w:rPr>
-          <w:rFonts w:ascii="Arial" w:hAnsi="Arial" w:cs="Arial"/>
-        </w:rPr>
-      </w:pPr>
-      <w:r>
-        <w:rPr>
-          <w:rFonts w:ascii="Arial" w:hAnsi="Arial" w:cs="Arial"/>
-        </w:rPr>
         <w:t>{% endif %}</w:t>
       </w:r>
     </w:p>
@@ -7685,7 +7711,6 @@
         <w:rPr>
           <w:rFonts w:ascii="Arial" w:hAnsi="Arial" w:cs="Arial"/>
         </w:rPr>
-        <w:lastRenderedPageBreak/>
         <w:t>Other: {{ summer_break_other }} (Start day/time: {{ summer_break_start }}; end day/time: {{ summer_break_end }})</w:t>
       </w:r>
     </w:p>
@@ -7700,6 +7725,7 @@
         <w:rPr>
           <w:rFonts w:ascii="Arial" w:hAnsi="Arial" w:cs="Arial"/>
         </w:rPr>
+        <w:lastRenderedPageBreak/>
         <w:t>{%</w:t>
       </w:r>
       <w:r>
@@ -9211,7 +9237,7 @@
 </file>
 
 <file path=word/endnotes.xml><?xml version="1.0" encoding="utf-8"?>
-<w:endnotes xmlns:wpc="http://schemas.microsoft.com/office/word/2010/wordprocessingCanvas" xmlns:cx="http://schemas.microsoft.com/office/drawing/2014/chartex" xmlns:cx1="http://schemas.microsoft.com/office/drawing/2015/9/8/chartex" xmlns:cx2="http://schemas.microsoft.com/office/drawing/2015/10/21/chartex" xmlns:cx3="http://schemas.microsoft.com/office/drawing/2016/5/9/chartex" xmlns:cx4="http://schemas.microsoft.com/office/drawing/2016/5/10/chartex" xmlns:cx5="http://schemas.microsoft.com/office/drawing/2016/5/11/chartex" xmlns:cx6="http://schemas.microsoft.com/office/drawing/2016/5/12/chartex" xmlns:cx7="http://schemas.microsoft.com/office/drawing/2016/5/13/chartex" xmlns:cx8="http://schemas.microsoft.com/office/drawing/2016/5/14/chartex" xmlns:mc="http://schemas.openxmlformats.org/markup-compatibility/2006" xmlns:aink="http://schemas.microsoft.com/office/drawing/2016/ink" xmlns:am3d="http://schemas.microsoft.com/office/drawing/2017/model3d" xmlns:o="urn:schemas-microsoft-com:office:office" xmlns:oel="http://schemas.microsoft.com/office/2019/extlst" xmlns:r="http://schemas.openxmlformats.org/officeDocument/2006/relationships" xmlns:m="http://schemas.openxmlformats.org/officeDocument/2006/math" xmlns:v="urn:schemas-microsoft-com:vml" xmlns:wp14="http://schemas.microsoft.com/office/word/2010/wordprocessingDrawing" xmlns:wp="http://schemas.openxmlformats.org/drawingml/2006/wordprocessingDrawing" xmlns:w10="urn:schemas-microsoft-com:office:word" xmlns:w="http://schemas.openxmlformats.org/wordprocessingml/2006/main" xmlns:w14="http://schemas.microsoft.com/office/word/2010/wordml" xmlns:w15="http://schemas.microsoft.com/office/word/2012/wordml" xmlns:w16cex="http://schemas.microsoft.com/office/word/2018/wordml/cex" xmlns:w16cid="http://schemas.microsoft.com/office/word/2016/wordml/cid" xmlns:w16="http://schemas.microsoft.com/office/word/2018/wordml" xmlns:w16sdtdh="http://schemas.microsoft.com/office/word/2020/wordml/sdtdatahash" xmlns:w16se="http://schemas.microsoft.com/office/word/2015/wordml/symex" xmlns:wpg="http://schemas.microsoft.com/office/word/2010/wordprocessingGroup" xmlns:wpi="http://schemas.microsoft.com/office/word/2010/wordprocessingInk" xmlns:wne="http://schemas.microsoft.com/office/word/2006/wordml" xmlns:wps="http://schemas.microsoft.com/office/word/2010/wordprocessingShape" mc:Ignorable="w14 w15 w16se w16cid w16 w16cex w16sdtdh wp14">
+<w:endnotes xmlns:wpc="http://schemas.microsoft.com/office/word/2010/wordprocessingCanvas" xmlns:cx="http://schemas.microsoft.com/office/drawing/2014/chartex" xmlns:cx1="http://schemas.microsoft.com/office/drawing/2015/9/8/chartex" xmlns:cx2="http://schemas.microsoft.com/office/drawing/2015/10/21/chartex" xmlns:cx3="http://schemas.microsoft.com/office/drawing/2016/5/9/chartex" xmlns:cx4="http://schemas.microsoft.com/office/drawing/2016/5/10/chartex" xmlns:cx5="http://schemas.microsoft.com/office/drawing/2016/5/11/chartex" xmlns:cx6="http://schemas.microsoft.com/office/drawing/2016/5/12/chartex" xmlns:cx7="http://schemas.microsoft.com/office/drawing/2016/5/13/chartex" xmlns:cx8="http://schemas.microsoft.com/office/drawing/2016/5/14/chartex" xmlns:mc="http://schemas.openxmlformats.org/markup-compatibility/2006" xmlns:aink="http://schemas.microsoft.com/office/drawing/2016/ink" xmlns:am3d="http://schemas.microsoft.com/office/drawing/2017/model3d" xmlns:o="urn:schemas-microsoft-com:office:office" xmlns:oel="http://schemas.microsoft.com/office/2019/extlst" xmlns:r="http://schemas.openxmlformats.org/officeDocument/2006/relationships" xmlns:m="http://schemas.openxmlformats.org/officeDocument/2006/math" xmlns:v="urn:schemas-microsoft-com:vml" xmlns:wp14="http://schemas.microsoft.com/office/word/2010/wordprocessingDrawing" xmlns:wp="http://schemas.openxmlformats.org/drawingml/2006/wordprocessingDrawing" xmlns:w10="urn:schemas-microsoft-com:office:word" xmlns:w="http://schemas.openxmlformats.org/wordprocessingml/2006/main" xmlns:w14="http://schemas.microsoft.com/office/word/2010/wordml" xmlns:w15="http://schemas.microsoft.com/office/word/2012/wordml" xmlns:w16cex="http://schemas.microsoft.com/office/word/2018/wordml/cex" xmlns:w16cid="http://schemas.microsoft.com/office/word/2016/wordml/cid" xmlns:w16="http://schemas.microsoft.com/office/word/2018/wordml" xmlns:w16du="http://schemas.microsoft.com/office/word/2023/wordml/word16du" xmlns:w16sdtdh="http://schemas.microsoft.com/office/word/2020/wordml/sdtdatahash" xmlns:w16sdtfl="http://schemas.microsoft.com/office/word/2024/wordml/sdtformatlock" xmlns:w16se="http://schemas.microsoft.com/office/word/2015/wordml/symex" xmlns:wpg="http://schemas.microsoft.com/office/word/2010/wordprocessingGroup" xmlns:wpi="http://schemas.microsoft.com/office/word/2010/wordprocessingInk" xmlns:wne="http://schemas.microsoft.com/office/word/2006/wordml" xmlns:wps="http://schemas.microsoft.com/office/word/2010/wordprocessingShape" mc:Ignorable="w14 w15 w16se w16cid w16 w16cex w16sdtdh w16sdtfl w16du wp14">
   <w:endnote w:type="separator" w:id="-1">
     <w:p>
       <w:pPr>
@@ -9236,7 +9262,7 @@
 </file>
 
 <file path=word/footer1.xml><?xml version="1.0" encoding="utf-8"?>
-<w:ftr xmlns:wpc="http://schemas.microsoft.com/office/word/2010/wordprocessingCanvas" xmlns:cx="http://schemas.microsoft.com/office/drawing/2014/chartex" xmlns:cx1="http://schemas.microsoft.com/office/drawing/2015/9/8/chartex" xmlns:cx2="http://schemas.microsoft.com/office/drawing/2015/10/21/chartex" xmlns:cx3="http://schemas.microsoft.com/office/drawing/2016/5/9/chartex" xmlns:cx4="http://schemas.microsoft.com/office/drawing/2016/5/10/chartex" xmlns:cx5="http://schemas.microsoft.com/office/drawing/2016/5/11/chartex" xmlns:cx6="http://schemas.microsoft.com/office/drawing/2016/5/12/chartex" xmlns:cx7="http://schemas.microsoft.com/office/drawing/2016/5/13/chartex" xmlns:cx8="http://schemas.microsoft.com/office/drawing/2016/5/14/chartex" xmlns:mc="http://schemas.openxmlformats.org/markup-compatibility/2006" xmlns:aink="http://schemas.microsoft.com/office/drawing/2016/ink" xmlns:am3d="http://schemas.microsoft.com/office/drawing/2017/model3d" xmlns:o="urn:schemas-microsoft-com:office:office" xmlns:oel="http://schemas.microsoft.com/office/2019/extlst" xmlns:r="http://schemas.openxmlformats.org/officeDocument/2006/relationships" xmlns:m="http://schemas.openxmlformats.org/officeDocument/2006/math" xmlns:v="urn:schemas-microsoft-com:vml" xmlns:wp14="http://schemas.microsoft.com/office/word/2010/wordprocessingDrawing" xmlns:wp="http://schemas.openxmlformats.org/drawingml/2006/wordprocessingDrawing" xmlns:w10="urn:schemas-microsoft-com:office:word" xmlns:w="http://schemas.openxmlformats.org/wordprocessingml/2006/main" xmlns:w14="http://schemas.microsoft.com/office/word/2010/wordml" xmlns:w15="http://schemas.microsoft.com/office/word/2012/wordml" xmlns:w16cex="http://schemas.microsoft.com/office/word/2018/wordml/cex" xmlns:w16cid="http://schemas.microsoft.com/office/word/2016/wordml/cid" xmlns:w16="http://schemas.microsoft.com/office/word/2018/wordml" xmlns:w16sdtdh="http://schemas.microsoft.com/office/word/2020/wordml/sdtdatahash" xmlns:w16se="http://schemas.microsoft.com/office/word/2015/wordml/symex" xmlns:wpg="http://schemas.microsoft.com/office/word/2010/wordprocessingGroup" xmlns:wpi="http://schemas.microsoft.com/office/word/2010/wordprocessingInk" xmlns:wne="http://schemas.microsoft.com/office/word/2006/wordml" xmlns:wps="http://schemas.microsoft.com/office/word/2010/wordprocessingShape" mc:Ignorable="w14 w15 w16se w16cid w16 w16cex w16sdtdh wp14">
+<w:ftr xmlns:wpc="http://schemas.microsoft.com/office/word/2010/wordprocessingCanvas" xmlns:cx="http://schemas.microsoft.com/office/drawing/2014/chartex" xmlns:cx1="http://schemas.microsoft.com/office/drawing/2015/9/8/chartex" xmlns:cx2="http://schemas.microsoft.com/office/drawing/2015/10/21/chartex" xmlns:cx3="http://schemas.microsoft.com/office/drawing/2016/5/9/chartex" xmlns:cx4="http://schemas.microsoft.com/office/drawing/2016/5/10/chartex" xmlns:cx5="http://schemas.microsoft.com/office/drawing/2016/5/11/chartex" xmlns:cx6="http://schemas.microsoft.com/office/drawing/2016/5/12/chartex" xmlns:cx7="http://schemas.microsoft.com/office/drawing/2016/5/13/chartex" xmlns:cx8="http://schemas.microsoft.com/office/drawing/2016/5/14/chartex" xmlns:mc="http://schemas.openxmlformats.org/markup-compatibility/2006" xmlns:aink="http://schemas.microsoft.com/office/drawing/2016/ink" xmlns:am3d="http://schemas.microsoft.com/office/drawing/2017/model3d" xmlns:o="urn:schemas-microsoft-com:office:office" xmlns:oel="http://schemas.microsoft.com/office/2019/extlst" xmlns:r="http://schemas.openxmlformats.org/officeDocument/2006/relationships" xmlns:m="http://schemas.openxmlformats.org/officeDocument/2006/math" xmlns:v="urn:schemas-microsoft-com:vml" xmlns:wp14="http://schemas.microsoft.com/office/word/2010/wordprocessingDrawing" xmlns:wp="http://schemas.openxmlformats.org/drawingml/2006/wordprocessingDrawing" xmlns:w10="urn:schemas-microsoft-com:office:word" xmlns:w="http://schemas.openxmlformats.org/wordprocessingml/2006/main" xmlns:w14="http://schemas.microsoft.com/office/word/2010/wordml" xmlns:w15="http://schemas.microsoft.com/office/word/2012/wordml" xmlns:w16cex="http://schemas.microsoft.com/office/word/2018/wordml/cex" xmlns:w16cid="http://schemas.microsoft.com/office/word/2016/wordml/cid" xmlns:w16="http://schemas.microsoft.com/office/word/2018/wordml" xmlns:w16du="http://schemas.microsoft.com/office/word/2023/wordml/word16du" xmlns:w16sdtdh="http://schemas.microsoft.com/office/word/2020/wordml/sdtdatahash" xmlns:w16sdtfl="http://schemas.microsoft.com/office/word/2024/wordml/sdtformatlock" xmlns:w16se="http://schemas.microsoft.com/office/word/2015/wordml/symex" xmlns:wpg="http://schemas.microsoft.com/office/word/2010/wordprocessingGroup" xmlns:wpi="http://schemas.microsoft.com/office/word/2010/wordprocessingInk" xmlns:wne="http://schemas.microsoft.com/office/word/2006/wordml" xmlns:wps="http://schemas.microsoft.com/office/word/2010/wordprocessingShape" mc:Ignorable="w14 w15 w16se w16cid w16 w16cex w16sdtdh w16sdtfl w16du wp14">
   <w:sdt>
     <w:sdtPr>
       <w:rPr>
@@ -9364,7 +9390,7 @@
 </file>
 
 <file path=word/footnotes.xml><?xml version="1.0" encoding="utf-8"?>
-<w:footnotes xmlns:wpc="http://schemas.microsoft.com/office/word/2010/wordprocessingCanvas" xmlns:cx="http://schemas.microsoft.com/office/drawing/2014/chartex" xmlns:cx1="http://schemas.microsoft.com/office/drawing/2015/9/8/chartex" xmlns:cx2="http://schemas.microsoft.com/office/drawing/2015/10/21/chartex" xmlns:cx3="http://schemas.microsoft.com/office/drawing/2016/5/9/chartex" xmlns:cx4="http://schemas.microsoft.com/office/drawing/2016/5/10/chartex" xmlns:cx5="http://schemas.microsoft.com/office/drawing/2016/5/11/chartex" xmlns:cx6="http://schemas.microsoft.com/office/drawing/2016/5/12/chartex" xmlns:cx7="http://schemas.microsoft.com/office/drawing/2016/5/13/chartex" xmlns:cx8="http://schemas.microsoft.com/office/drawing/2016/5/14/chartex" xmlns:mc="http://schemas.openxmlformats.org/markup-compatibility/2006" xmlns:aink="http://schemas.microsoft.com/office/drawing/2016/ink" xmlns:am3d="http://schemas.microsoft.com/office/drawing/2017/model3d" xmlns:o="urn:schemas-microsoft-com:office:office" xmlns:oel="http://schemas.microsoft.com/office/2019/extlst" xmlns:r="http://schemas.openxmlformats.org/officeDocument/2006/relationships" xmlns:m="http://schemas.openxmlformats.org/officeDocument/2006/math" xmlns:v="urn:schemas-microsoft-com:vml" xmlns:wp14="http://schemas.microsoft.com/office/word/2010/wordprocessingDrawing" xmlns:wp="http://schemas.openxmlformats.org/drawingml/2006/wordprocessingDrawing" xmlns:w10="urn:schemas-microsoft-com:office:word" xmlns:w="http://schemas.openxmlformats.org/wordprocessingml/2006/main" xmlns:w14="http://schemas.microsoft.com/office/word/2010/wordml" xmlns:w15="http://schemas.microsoft.com/office/word/2012/wordml" xmlns:w16cex="http://schemas.microsoft.com/office/word/2018/wordml/cex" xmlns:w16cid="http://schemas.microsoft.com/office/word/2016/wordml/cid" xmlns:w16="http://schemas.microsoft.com/office/word/2018/wordml" xmlns:w16sdtdh="http://schemas.microsoft.com/office/word/2020/wordml/sdtdatahash" xmlns:w16se="http://schemas.microsoft.com/office/word/2015/wordml/symex" xmlns:wpg="http://schemas.microsoft.com/office/word/2010/wordprocessingGroup" xmlns:wpi="http://schemas.microsoft.com/office/word/2010/wordprocessingInk" xmlns:wne="http://schemas.microsoft.com/office/word/2006/wordml" xmlns:wps="http://schemas.microsoft.com/office/word/2010/wordprocessingShape" mc:Ignorable="w14 w15 w16se w16cid w16 w16cex w16sdtdh wp14">
+<w:footnotes xmlns:wpc="http://schemas.microsoft.com/office/word/2010/wordprocessingCanvas" xmlns:cx="http://schemas.microsoft.com/office/drawing/2014/chartex" xmlns:cx1="http://schemas.microsoft.com/office/drawing/2015/9/8/chartex" xmlns:cx2="http://schemas.microsoft.com/office/drawing/2015/10/21/chartex" xmlns:cx3="http://schemas.microsoft.com/office/drawing/2016/5/9/chartex" xmlns:cx4="http://schemas.microsoft.com/office/drawing/2016/5/10/chartex" xmlns:cx5="http://schemas.microsoft.com/office/drawing/2016/5/11/chartex" xmlns:cx6="http://schemas.microsoft.com/office/drawing/2016/5/12/chartex" xmlns:cx7="http://schemas.microsoft.com/office/drawing/2016/5/13/chartex" xmlns:cx8="http://schemas.microsoft.com/office/drawing/2016/5/14/chartex" xmlns:mc="http://schemas.openxmlformats.org/markup-compatibility/2006" xmlns:aink="http://schemas.microsoft.com/office/drawing/2016/ink" xmlns:am3d="http://schemas.microsoft.com/office/drawing/2017/model3d" xmlns:o="urn:schemas-microsoft-com:office:office" xmlns:oel="http://schemas.microsoft.com/office/2019/extlst" xmlns:r="http://schemas.openxmlformats.org/officeDocument/2006/relationships" xmlns:m="http://schemas.openxmlformats.org/officeDocument/2006/math" xmlns:v="urn:schemas-microsoft-com:vml" xmlns:wp14="http://schemas.microsoft.com/office/word/2010/wordprocessingDrawing" xmlns:wp="http://schemas.openxmlformats.org/drawingml/2006/wordprocessingDrawing" xmlns:w10="urn:schemas-microsoft-com:office:word" xmlns:w="http://schemas.openxmlformats.org/wordprocessingml/2006/main" xmlns:w14="http://schemas.microsoft.com/office/word/2010/wordml" xmlns:w15="http://schemas.microsoft.com/office/word/2012/wordml" xmlns:w16cex="http://schemas.microsoft.com/office/word/2018/wordml/cex" xmlns:w16cid="http://schemas.microsoft.com/office/word/2016/wordml/cid" xmlns:w16="http://schemas.microsoft.com/office/word/2018/wordml" xmlns:w16du="http://schemas.microsoft.com/office/word/2023/wordml/word16du" xmlns:w16sdtdh="http://schemas.microsoft.com/office/word/2020/wordml/sdtdatahash" xmlns:w16sdtfl="http://schemas.microsoft.com/office/word/2024/wordml/sdtformatlock" xmlns:w16se="http://schemas.microsoft.com/office/word/2015/wordml/symex" xmlns:wpg="http://schemas.microsoft.com/office/word/2010/wordprocessingGroup" xmlns:wpi="http://schemas.microsoft.com/office/word/2010/wordprocessingInk" xmlns:wne="http://schemas.microsoft.com/office/word/2006/wordml" xmlns:wps="http://schemas.microsoft.com/office/word/2010/wordprocessingShape" mc:Ignorable="w14 w15 w16se w16cid w16 w16cex w16sdtdh w16sdtfl w16du wp14">
   <w:footnote w:type="separator" w:id="-1">
     <w:p>
       <w:pPr>
@@ -9389,7 +9415,7 @@
 </file>
 
 <file path=word/numbering.xml><?xml version="1.0" encoding="utf-8"?>
-<w:numbering xmlns:wpc="http://schemas.microsoft.com/office/word/2010/wordprocessingCanvas" xmlns:cx="http://schemas.microsoft.com/office/drawing/2014/chartex" xmlns:cx1="http://schemas.microsoft.com/office/drawing/2015/9/8/chartex" xmlns:cx2="http://schemas.microsoft.com/office/drawing/2015/10/21/chartex" xmlns:cx3="http://schemas.microsoft.com/office/drawing/2016/5/9/chartex" xmlns:cx4="http://schemas.microsoft.com/office/drawing/2016/5/10/chartex" xmlns:cx5="http://schemas.microsoft.com/office/drawing/2016/5/11/chartex" xmlns:cx6="http://schemas.microsoft.com/office/drawing/2016/5/12/chartex" xmlns:cx7="http://schemas.microsoft.com/office/drawing/2016/5/13/chartex" xmlns:cx8="http://schemas.microsoft.com/office/drawing/2016/5/14/chartex" xmlns:mc="http://schemas.openxmlformats.org/markup-compatibility/2006" xmlns:aink="http://schemas.microsoft.com/office/drawing/2016/ink" xmlns:am3d="http://schemas.microsoft.com/office/drawing/2017/model3d" xmlns:o="urn:schemas-microsoft-com:office:office" xmlns:oel="http://schemas.microsoft.com/office/2019/extlst" xmlns:r="http://schemas.openxmlformats.org/officeDocument/2006/relationships" xmlns:m="http://schemas.openxmlformats.org/officeDocument/2006/math" xmlns:v="urn:schemas-microsoft-com:vml" xmlns:wp14="http://schemas.microsoft.com/office/word/2010/wordprocessingDrawing" xmlns:wp="http://schemas.openxmlformats.org/drawingml/2006/wordprocessingDrawing" xmlns:w10="urn:schemas-microsoft-com:office:word" xmlns:w="http://schemas.openxmlformats.org/wordprocessingml/2006/main" xmlns:w14="http://schemas.microsoft.com/office/word/2010/wordml" xmlns:w15="http://schemas.microsoft.com/office/word/2012/wordml" xmlns:w16cex="http://schemas.microsoft.com/office/word/2018/wordml/cex" xmlns:w16cid="http://schemas.microsoft.com/office/word/2016/wordml/cid" xmlns:w16="http://schemas.microsoft.com/office/word/2018/wordml" xmlns:w16sdtdh="http://schemas.microsoft.com/office/word/2020/wordml/sdtdatahash" xmlns:w16se="http://schemas.microsoft.com/office/word/2015/wordml/symex" xmlns:wpg="http://schemas.microsoft.com/office/word/2010/wordprocessingGroup" xmlns:wpi="http://schemas.microsoft.com/office/word/2010/wordprocessingInk" xmlns:wne="http://schemas.microsoft.com/office/word/2006/wordml" xmlns:wps="http://schemas.microsoft.com/office/word/2010/wordprocessingShape" mc:Ignorable="w14 w15 w16se w16cid w16 w16cex w16sdtdh wp14">
+<w:numbering xmlns:wpc="http://schemas.microsoft.com/office/word/2010/wordprocessingCanvas" xmlns:cx="http://schemas.microsoft.com/office/drawing/2014/chartex" xmlns:cx1="http://schemas.microsoft.com/office/drawing/2015/9/8/chartex" xmlns:cx2="http://schemas.microsoft.com/office/drawing/2015/10/21/chartex" xmlns:cx3="http://schemas.microsoft.com/office/drawing/2016/5/9/chartex" xmlns:cx4="http://schemas.microsoft.com/office/drawing/2016/5/10/chartex" xmlns:cx5="http://schemas.microsoft.com/office/drawing/2016/5/11/chartex" xmlns:cx6="http://schemas.microsoft.com/office/drawing/2016/5/12/chartex" xmlns:cx7="http://schemas.microsoft.com/office/drawing/2016/5/13/chartex" xmlns:cx8="http://schemas.microsoft.com/office/drawing/2016/5/14/chartex" xmlns:mc="http://schemas.openxmlformats.org/markup-compatibility/2006" xmlns:aink="http://schemas.microsoft.com/office/drawing/2016/ink" xmlns:am3d="http://schemas.microsoft.com/office/drawing/2017/model3d" xmlns:o="urn:schemas-microsoft-com:office:office" xmlns:oel="http://schemas.microsoft.com/office/2019/extlst" xmlns:r="http://schemas.openxmlformats.org/officeDocument/2006/relationships" xmlns:m="http://schemas.openxmlformats.org/officeDocument/2006/math" xmlns:v="urn:schemas-microsoft-com:vml" xmlns:wp14="http://schemas.microsoft.com/office/word/2010/wordprocessingDrawing" xmlns:wp="http://schemas.openxmlformats.org/drawingml/2006/wordprocessingDrawing" xmlns:w10="urn:schemas-microsoft-com:office:word" xmlns:w="http://schemas.openxmlformats.org/wordprocessingml/2006/main" xmlns:w14="http://schemas.microsoft.com/office/word/2010/wordml" xmlns:w15="http://schemas.microsoft.com/office/word/2012/wordml" xmlns:w16cex="http://schemas.microsoft.com/office/word/2018/wordml/cex" xmlns:w16cid="http://schemas.microsoft.com/office/word/2016/wordml/cid" xmlns:w16="http://schemas.microsoft.com/office/word/2018/wordml" xmlns:w16du="http://schemas.microsoft.com/office/word/2023/wordml/word16du" xmlns:w16sdtdh="http://schemas.microsoft.com/office/word/2020/wordml/sdtdatahash" xmlns:w16sdtfl="http://schemas.microsoft.com/office/word/2024/wordml/sdtformatlock" xmlns:w16se="http://schemas.microsoft.com/office/word/2015/wordml/symex" xmlns:wpg="http://schemas.microsoft.com/office/word/2010/wordprocessingGroup" xmlns:wpi="http://schemas.microsoft.com/office/word/2010/wordprocessingInk" xmlns:wne="http://schemas.microsoft.com/office/word/2006/wordml" xmlns:wps="http://schemas.microsoft.com/office/word/2010/wordprocessingShape" mc:Ignorable="w14 w15 w16se w16cid w16 w16cex w16sdtdh w16sdtfl w16du wp14">
   <w:abstractNum w:abstractNumId="0" w15:restartNumberingAfterBreak="0">
     <w:nsid w:val="188C77DD"/>
     <w:multiLevelType w:val="hybridMultilevel"/>
@@ -9786,7 +9812,7 @@
 </file>
 
 <file path=word/styles.xml><?xml version="1.0" encoding="utf-8"?>
-<w:styles xmlns:mc="http://schemas.openxmlformats.org/markup-compatibility/2006" xmlns:r="http://schemas.openxmlformats.org/officeDocument/2006/relationships" xmlns:w="http://schemas.openxmlformats.org/wordprocessingml/2006/main" xmlns:w14="http://schemas.microsoft.com/office/word/2010/wordml" xmlns:w15="http://schemas.microsoft.com/office/word/2012/wordml" xmlns:w16cex="http://schemas.microsoft.com/office/word/2018/wordml/cex" xmlns:w16cid="http://schemas.microsoft.com/office/word/2016/wordml/cid" xmlns:w16="http://schemas.microsoft.com/office/word/2018/wordml" xmlns:w16sdtdh="http://schemas.microsoft.com/office/word/2020/wordml/sdtdatahash" xmlns:w16se="http://schemas.microsoft.com/office/word/2015/wordml/symex" mc:Ignorable="w14 w15 w16se w16cid w16 w16cex w16sdtdh">
+<w:styles xmlns:mc="http://schemas.openxmlformats.org/markup-compatibility/2006" xmlns:r="http://schemas.openxmlformats.org/officeDocument/2006/relationships" xmlns:w="http://schemas.openxmlformats.org/wordprocessingml/2006/main" xmlns:w14="http://schemas.microsoft.com/office/word/2010/wordml" xmlns:w15="http://schemas.microsoft.com/office/word/2012/wordml" xmlns:w16cex="http://schemas.microsoft.com/office/word/2018/wordml/cex" xmlns:w16cid="http://schemas.microsoft.com/office/word/2016/wordml/cid" xmlns:w16="http://schemas.microsoft.com/office/word/2018/wordml" xmlns:w16du="http://schemas.microsoft.com/office/word/2023/wordml/word16du" xmlns:w16sdtdh="http://schemas.microsoft.com/office/word/2020/wordml/sdtdatahash" xmlns:w16sdtfl="http://schemas.microsoft.com/office/word/2024/wordml/sdtformatlock" xmlns:w16se="http://schemas.microsoft.com/office/word/2015/wordml/symex" mc:Ignorable="w14 w15 w16se w16cid w16 w16cex w16sdtdh w16sdtfl w16du">
   <w:docDefaults>
     <w:rPrDefault>
       <w:rPr>

</xml_diff>